<commit_message>
Architecture Design updates * architecture standard updated * additional arch. design doc. for staff profile mang. * reorganization of folders
</commit_message>
<xml_diff>
--- a/Program/Architecture Standards.docx
+++ b/Program/Architecture Standards.docx
@@ -12,42 +12,6 @@
       <w:r>
         <w:rPr>
           <w:rFonts w:ascii="Times New Roman" w:hAnsi="Times New Roman" w:cs="Times New Roman"/>
-          <w:b/>
-          <w:bCs/>
-        </w:rPr>
-        <w:t>Names</w:t>
-      </w:r>
-    </w:p>
-    <w:p>
-      <w:pPr>
-        <w:spacing w:line="480" w:lineRule="auto"/>
-        <w:rPr>
-          <w:rFonts w:ascii="Times New Roman" w:hAnsi="Times New Roman" w:cs="Times New Roman"/>
-        </w:rPr>
-      </w:pPr>
-      <w:r>
-        <w:rPr>
-          <w:rFonts w:ascii="Times New Roman" w:hAnsi="Times New Roman" w:cs="Times New Roman"/>
-        </w:rPr>
-        <w:tab/>
-        <w:t>General Standard</w:t>
-      </w:r>
-    </w:p>
-    <w:p>
-      <w:pPr>
-        <w:pStyle w:val="ListParagraph"/>
-        <w:numPr>
-          <w:ilvl w:val="0"/>
-          <w:numId w:val="1"/>
-        </w:numPr>
-        <w:spacing w:line="480" w:lineRule="auto"/>
-        <w:rPr>
-          <w:rFonts w:ascii="Times New Roman" w:hAnsi="Times New Roman" w:cs="Times New Roman"/>
-        </w:rPr>
-      </w:pPr>
-      <w:r>
-        <w:rPr>
-          <w:rFonts w:ascii="Times New Roman" w:hAnsi="Times New Roman" w:cs="Times New Roman"/>
         </w:rPr>
         <w:t xml:space="preserve">Variable names follow </w:t>
       </w:r>
@@ -60,11 +24,6 @@
     </w:p>
     <w:p>
       <w:pPr>
-        <w:pStyle w:val="ListParagraph"/>
-        <w:numPr>
-          <w:ilvl w:val="0"/>
-          <w:numId w:val="1"/>
-        </w:numPr>
         <w:spacing w:line="480" w:lineRule="auto"/>
         <w:rPr>
           <w:rFonts w:ascii="Times New Roman" w:hAnsi="Times New Roman" w:cs="Times New Roman"/>
@@ -74,7 +33,13 @@
         <w:rPr>
           <w:rFonts w:ascii="Times New Roman" w:hAnsi="Times New Roman" w:cs="Times New Roman"/>
         </w:rPr>
-        <w:t xml:space="preserve">Class names follow </w:t>
+        <w:t>Parent c</w:t>
+      </w:r>
+      <w:r>
+        <w:rPr>
+          <w:rFonts w:ascii="Times New Roman" w:hAnsi="Times New Roman" w:cs="Times New Roman"/>
+        </w:rPr>
+        <w:t xml:space="preserve">lass names follow </w:t>
       </w:r>
       <w:proofErr w:type="spellStart"/>
       <w:r>
@@ -87,11 +52,35 @@
     </w:p>
     <w:p>
       <w:pPr>
-        <w:pStyle w:val="ListParagraph"/>
-        <w:numPr>
-          <w:ilvl w:val="0"/>
-          <w:numId w:val="1"/>
-        </w:numPr>
+        <w:spacing w:line="480" w:lineRule="auto"/>
+        <w:ind w:left="720"/>
+        <w:rPr>
+          <w:rFonts w:ascii="Times New Roman" w:hAnsi="Times New Roman" w:cs="Times New Roman"/>
+        </w:rPr>
+      </w:pPr>
+      <w:r>
+        <w:rPr>
+          <w:rFonts w:ascii="Times New Roman" w:hAnsi="Times New Roman" w:cs="Times New Roman"/>
+        </w:rPr>
+        <w:t xml:space="preserve">Child class names also follow </w:t>
+      </w:r>
+      <w:proofErr w:type="spellStart"/>
+      <w:r>
+        <w:rPr>
+          <w:rFonts w:ascii="Times New Roman" w:hAnsi="Times New Roman" w:cs="Times New Roman"/>
+        </w:rPr>
+        <w:t>PascalCase</w:t>
+      </w:r>
+      <w:proofErr w:type="spellEnd"/>
+      <w:r>
+        <w:rPr>
+          <w:rFonts w:ascii="Times New Roman" w:hAnsi="Times New Roman" w:cs="Times New Roman"/>
+        </w:rPr>
+        <w:t>. They mirror the name of their parent class concatenated with a unique name.</w:t>
+      </w:r>
+    </w:p>
+    <w:p>
+      <w:pPr>
         <w:spacing w:line="480" w:lineRule="auto"/>
         <w:rPr>
           <w:rFonts w:ascii="Times New Roman" w:hAnsi="Times New Roman" w:cs="Times New Roman"/>
@@ -114,11 +103,6 @@
     </w:p>
     <w:p>
       <w:pPr>
-        <w:pStyle w:val="ListParagraph"/>
-        <w:numPr>
-          <w:ilvl w:val="0"/>
-          <w:numId w:val="1"/>
-        </w:numPr>
         <w:spacing w:line="480" w:lineRule="auto"/>
         <w:rPr>
           <w:rFonts w:ascii="Times New Roman" w:hAnsi="Times New Roman" w:cs="Times New Roman"/>
@@ -138,6 +122,15 @@
         <w:t>example_List</w:t>
       </w:r>
       <w:proofErr w:type="spellEnd"/>
+    </w:p>
+    <w:p>
+      <w:pPr>
+        <w:spacing w:line="480" w:lineRule="auto"/>
+        <w:ind w:left="720"/>
+        <w:rPr>
+          <w:rFonts w:ascii="Times New Roman" w:hAnsi="Times New Roman" w:cs="Times New Roman"/>
+        </w:rPr>
+      </w:pPr>
     </w:p>
     <w:sectPr>
       <w:pgSz w:w="12240" w:h="15840"/>

</xml_diff>